<commit_message>
changed currently reading section
</commit_message>
<xml_diff>
--- a/Software_Engineering_Resume.docx
+++ b/Software_Engineering_Resume.docx
@@ -7,20 +7,20 @@
         <w:spacing w:after="10" w:lineRule="auto"/>
         <w:jc w:val="center"/>
         <w:rPr>
-          <w:sz w:val="40"/>
-          <w:szCs w:val="40"/>
-        </w:rPr>
-      </w:pPr>
-      <w:r>
-        <w:rPr>
-          <w:rFonts w:ascii="Arial" w:cs="Arial" w:eastAsia="Arial" w:hAnsi="Arial"/>
-          <w:b w:val="0"/>
-          <w:bCs w:val="0"/>
-          <w:i w:val="0"/>
-          <w:iCs w:val="0"/>
-          <w:color w:val="111111"/>
-          <w:sz w:val="40"/>
-          <w:szCs w:val="40"/>
+          <w:sz w:val="30"/>
+          <w:szCs w:val="30"/>
+        </w:rPr>
+      </w:pPr>
+      <w:r>
+        <w:rPr>
+          <w:rFonts w:ascii="Arial" w:cs="Arial" w:eastAsia="Arial" w:hAnsi="Arial"/>
+          <w:b w:val="0"/>
+          <w:bCs w:val="0"/>
+          <w:i w:val="0"/>
+          <w:iCs w:val="0"/>
+          <w:color w:val="111111"/>
+          <w:sz w:val="30"/>
+          <w:szCs w:val="30"/>
           <w:rtl w:val="0"/>
         </w:rPr>
         <w:t xml:space="preserve">Shaiera Sohel Shera</w:t>
@@ -35,7 +35,10 @@
       <w:pPr>
         <w:spacing w:after="60" w:line="240" w:lineRule="auto"/>
         <w:jc w:val="center"/>
-        <w:rPr/>
+        <w:rPr>
+          <w:sz w:val="18"/>
+          <w:szCs w:val="18"/>
+        </w:rPr>
       </w:pPr>
       <w:r>
         <w:rPr>
@@ -45,8 +48,8 @@
           <w:i w:val="0"/>
           <w:iCs w:val="0"/>
           <w:color w:val="666666"/>
-          <w:sz w:val="20"/>
-          <w:szCs w:val="20"/>
+          <w:sz w:val="18"/>
+          <w:szCs w:val="18"/>
           <w:rtl w:val="0"/>
         </w:rPr>
         <w:t xml:space="preserve">Atlanta, GA | Open to Relocation | 678-622-2261 | sshaiera@gmail.com | Portfolio: sshai404.github.io | GitHub: github.com/sshai404</w:t>
@@ -64,8 +67,8 @@
         </w:pBdr>
         <w:spacing w:after="32" w:before="64" w:line="240" w:lineRule="auto"/>
         <w:rPr>
-          <w:sz w:val="24"/>
-          <w:szCs w:val="24"/>
+          <w:sz w:val="22"/>
+          <w:szCs w:val="22"/>
         </w:rPr>
       </w:pPr>
       <w:r>
@@ -76,8 +79,8 @@
           <w:i w:val="0"/>
           <w:iCs w:val="0"/>
           <w:color w:val="1f4e79"/>
-          <w:sz w:val="24"/>
-          <w:szCs w:val="24"/>
+          <w:sz w:val="22"/>
+          <w:szCs w:val="22"/>
           <w:rtl w:val="0"/>
         </w:rPr>
         <w:t xml:space="preserve">SUMMARY</w:t>
@@ -92,23 +95,46 @@
       <w:pPr>
         <w:spacing w:after="12" w:line="257" w:lineRule="auto"/>
         <w:rPr>
-          <w:sz w:val="21"/>
-          <w:szCs w:val="21"/>
-        </w:rPr>
-      </w:pPr>
-      <w:r>
-        <w:rPr>
-          <w:rFonts w:ascii="Arial" w:cs="Arial" w:eastAsia="Arial" w:hAnsi="Arial"/>
-          <w:b w:val="0"/>
-          <w:bCs w:val="0"/>
-          <w:i w:val="0"/>
-          <w:iCs w:val="0"/>
-          <w:color w:val="111111"/>
-          <w:sz w:val="21"/>
-          <w:szCs w:val="21"/>
-          <w:rtl w:val="0"/>
-        </w:rPr>
-        <w:t xml:space="preserve">Computer Science student with experience in software development, front-end engineering, programming, and technical troubleshooting. Programming background includes Java, Python, JavaScript, R, and GML, with hands-on experience building interactive web interfaces, implementing game logic, and diagnosing technical issues.</w:t>
+          <w:sz w:val="19"/>
+          <w:szCs w:val="19"/>
+        </w:rPr>
+      </w:pPr>
+      <w:r>
+        <w:rPr>
+          <w:rFonts w:ascii="Arial" w:cs="Arial" w:eastAsia="Arial" w:hAnsi="Arial"/>
+          <w:b w:val="0"/>
+          <w:bCs w:val="0"/>
+          <w:i w:val="0"/>
+          <w:iCs w:val="0"/>
+          <w:color w:val="111111"/>
+          <w:sz w:val="19"/>
+          <w:szCs w:val="19"/>
+          <w:rtl w:val="0"/>
+        </w:rPr>
+        <w:t xml:space="preserve">Computer Science student with experience in software development, front-end engineering, programming, and technical troubleshooting. Programming background includes Java, Python, JavaScript, R, C, </w:t>
+      </w:r>
+      <w:r>
+        <w:rPr>
+          <w:color w:val="111111"/>
+          <w:sz w:val="19"/>
+          <w:szCs w:val="19"/>
+          <w:rtl w:val="0"/>
+        </w:rPr>
+        <w:t xml:space="preserve">Linux</w:t>
+      </w:r>
+      <w:r>
+        <w:rPr>
+          <w:rFonts w:ascii="Arial" w:cs="Arial" w:eastAsia="Arial" w:hAnsi="Arial"/>
+          <w:b w:val="0"/>
+          <w:bCs w:val="0"/>
+          <w:i w:val="0"/>
+          <w:iCs w:val="0"/>
+          <w:color w:val="111111"/>
+          <w:sz w:val="19"/>
+          <w:szCs w:val="19"/>
+          <w:rtl w:val="0"/>
+        </w:rPr>
+        <w:t xml:space="preserve"> and GML, with hands-on experience building interactive web interfaces, implementing game logic, and diagnosing technical issues.</w:t>
       </w:r>
       <w:r>
         <w:rPr>
@@ -123,8 +149,8 @@
         </w:pBdr>
         <w:spacing w:after="32" w:before="64" w:line="240" w:lineRule="auto"/>
         <w:rPr>
-          <w:sz w:val="24"/>
-          <w:szCs w:val="24"/>
+          <w:sz w:val="22"/>
+          <w:szCs w:val="22"/>
         </w:rPr>
       </w:pPr>
       <w:r>
@@ -135,8 +161,8 @@
           <w:i w:val="0"/>
           <w:iCs w:val="0"/>
           <w:color w:val="1f4e79"/>
-          <w:sz w:val="24"/>
-          <w:szCs w:val="24"/>
+          <w:sz w:val="22"/>
+          <w:szCs w:val="22"/>
           <w:rtl w:val="0"/>
         </w:rPr>
         <w:t xml:space="preserve">TECHNICAL SKILLS</w:t>
@@ -151,23 +177,23 @@
       <w:pPr>
         <w:spacing w:after="0" w:before="0" w:line="242" w:lineRule="auto"/>
         <w:rPr>
-          <w:sz w:val="21"/>
-          <w:szCs w:val="21"/>
-        </w:rPr>
-      </w:pPr>
-      <w:r>
-        <w:rPr>
-          <w:rFonts w:ascii="Arial" w:cs="Arial" w:eastAsia="Arial" w:hAnsi="Arial"/>
-          <w:b w:val="0"/>
-          <w:bCs w:val="0"/>
-          <w:i w:val="0"/>
-          <w:iCs w:val="0"/>
-          <w:color w:val="111111"/>
-          <w:sz w:val="21"/>
-          <w:szCs w:val="21"/>
-          <w:rtl w:val="0"/>
-        </w:rPr>
-        <w:t xml:space="preserve">Languages: Java, Python, JavaScript, R, GML | Web: HTML, CSS | Tools: VS Code, Kiro, GitHub | Additional: Adobe Suite, Blender, Maya</w:t>
+          <w:sz w:val="19"/>
+          <w:szCs w:val="19"/>
+        </w:rPr>
+      </w:pPr>
+      <w:r>
+        <w:rPr>
+          <w:rFonts w:ascii="Arial" w:cs="Arial" w:eastAsia="Arial" w:hAnsi="Arial"/>
+          <w:b w:val="0"/>
+          <w:bCs w:val="0"/>
+          <w:i w:val="0"/>
+          <w:iCs w:val="0"/>
+          <w:color w:val="111111"/>
+          <w:sz w:val="19"/>
+          <w:szCs w:val="19"/>
+          <w:rtl w:val="0"/>
+        </w:rPr>
+        <w:t xml:space="preserve">Languages: Java, Python, C, JavaScript, R, GML | Web: HTML, CSS | Tools: VS Code, Kiro, GitHub, Linux | Additional: Adobe Suite, Blender, Maya</w:t>
       </w:r>
       <w:r>
         <w:rPr>
@@ -179,20 +205,20 @@
       <w:pPr>
         <w:spacing w:after="0" w:before="0" w:line="242" w:lineRule="auto"/>
         <w:rPr>
-          <w:sz w:val="21"/>
-          <w:szCs w:val="21"/>
-        </w:rPr>
-      </w:pPr>
-      <w:r>
-        <w:rPr>
-          <w:rFonts w:ascii="Arial" w:cs="Arial" w:eastAsia="Arial" w:hAnsi="Arial"/>
-          <w:b w:val="0"/>
-          <w:bCs w:val="0"/>
-          <w:i w:val="0"/>
-          <w:iCs w:val="0"/>
-          <w:color w:val="111111"/>
-          <w:sz w:val="21"/>
-          <w:szCs w:val="21"/>
+          <w:sz w:val="19"/>
+          <w:szCs w:val="19"/>
+        </w:rPr>
+      </w:pPr>
+      <w:r>
+        <w:rPr>
+          <w:rFonts w:ascii="Arial" w:cs="Arial" w:eastAsia="Arial" w:hAnsi="Arial"/>
+          <w:b w:val="0"/>
+          <w:bCs w:val="0"/>
+          <w:i w:val="0"/>
+          <w:iCs w:val="0"/>
+          <w:color w:val="111111"/>
+          <w:sz w:val="19"/>
+          <w:szCs w:val="19"/>
           <w:rtl w:val="0"/>
         </w:rPr>
         <w:t xml:space="preserve">Technical Areas: Software Development, Front-End Development, Technical Troubleshooting, Game Development, Prototyping, 3D Modeling</w:t>
@@ -210,167 +236,145 @@
         </w:pBdr>
         <w:spacing w:after="32" w:before="64" w:line="240" w:lineRule="auto"/>
         <w:rPr>
-          <w:sz w:val="24"/>
-          <w:szCs w:val="24"/>
-        </w:rPr>
-      </w:pPr>
-      <w:r>
-        <w:rPr>
-          <w:rFonts w:ascii="Arial" w:cs="Arial" w:eastAsia="Arial" w:hAnsi="Arial"/>
-          <w:b w:val="0"/>
-          <w:bCs w:val="0"/>
-          <w:i w:val="0"/>
-          <w:iCs w:val="0"/>
+          <w:sz w:val="22"/>
+          <w:szCs w:val="22"/>
+        </w:rPr>
+      </w:pPr>
+      <w:r>
+        <w:rPr>
           <w:color w:val="1f4e79"/>
-          <w:sz w:val="24"/>
-          <w:szCs w:val="24"/>
-          <w:rtl w:val="0"/>
-        </w:rPr>
-        <w:t xml:space="preserve">PROJECTS</w:t>
-      </w:r>
-      <w:r>
-        <w:rPr>
-          <w:rtl w:val="0"/>
-        </w:rPr>
-      </w:r>
-    </w:p>
-    <w:p>
-      <w:pPr>
-        <w:spacing w:after="0" w:before="14" w:line="255" w:lineRule="auto"/>
-        <w:rPr>
-          <w:sz w:val="21"/>
-          <w:szCs w:val="21"/>
-        </w:rPr>
-      </w:pPr>
-      <w:r>
-        <w:rPr>
-          <w:rFonts w:ascii="Arial" w:cs="Arial" w:eastAsia="Arial" w:hAnsi="Arial"/>
+          <w:sz w:val="22"/>
+          <w:szCs w:val="22"/>
+          <w:rtl w:val="0"/>
+        </w:rPr>
+        <w:t xml:space="preserve">EDUCATION</w:t>
+      </w:r>
+      <w:r>
+        <w:rPr>
+          <w:rtl w:val="0"/>
+        </w:rPr>
+      </w:r>
+    </w:p>
+    <w:p>
+      <w:pPr>
+        <w:tabs>
+          <w:tab w:val="right" w:leader="none" w:pos="10728"/>
+        </w:tabs>
+        <w:spacing w:before="14" w:line="255" w:lineRule="auto"/>
+        <w:rPr>
+          <w:sz w:val="19"/>
+          <w:szCs w:val="19"/>
+        </w:rPr>
+      </w:pPr>
+      <w:r>
+        <w:rPr>
           <w:b w:val="1"/>
           <w:bCs w:val="1"/>
-          <w:i w:val="0"/>
-          <w:iCs w:val="0"/>
-          <w:color w:val="111111"/>
-          <w:sz w:val="21"/>
-          <w:szCs w:val="21"/>
-          <w:rtl w:val="0"/>
-        </w:rPr>
-        <w:t xml:space="preserve">Interactive Desktop Portfolio - HTML, CSS, JavaScript, GitHub Pages</w:t>
-      </w:r>
-      <w:r>
-        <w:rPr>
-          <w:rtl w:val="0"/>
-        </w:rPr>
-      </w:r>
-    </w:p>
-    <w:p>
-      <w:pPr>
-        <w:spacing w:after="7" w:before="0" w:line="257" w:lineRule="auto"/>
-        <w:ind w:left="230" w:hanging="115"/>
-        <w:rPr>
-          <w:sz w:val="21"/>
-          <w:szCs w:val="21"/>
-        </w:rPr>
-      </w:pPr>
-      <w:r>
-        <w:rPr>
-          <w:rFonts w:ascii="Arial" w:cs="Arial" w:eastAsia="Arial" w:hAnsi="Arial"/>
-          <w:b w:val="0"/>
-          <w:bCs w:val="0"/>
-          <w:i w:val="0"/>
-          <w:iCs w:val="0"/>
-          <w:color w:val="111111"/>
-          <w:sz w:val="21"/>
-          <w:szCs w:val="21"/>
-          <w:rtl w:val="0"/>
-        </w:rPr>
-        <w:t xml:space="preserve">• Developed and deployed an interactive single-page web application using vanilla HTML, CSS, and JavaScript without external frameworks.</w:t>
-      </w:r>
-      <w:r>
-        <w:rPr>
-          <w:rtl w:val="0"/>
-        </w:rPr>
-      </w:r>
-    </w:p>
-    <w:p>
-      <w:pPr>
-        <w:spacing w:after="7" w:before="0" w:line="257" w:lineRule="auto"/>
-        <w:ind w:left="230" w:hanging="115"/>
-        <w:rPr>
-          <w:sz w:val="21"/>
-          <w:szCs w:val="21"/>
-        </w:rPr>
-      </w:pPr>
-      <w:r>
-        <w:rPr>
-          <w:rFonts w:ascii="Arial" w:cs="Arial" w:eastAsia="Arial" w:hAnsi="Arial"/>
-          <w:b w:val="0"/>
-          <w:bCs w:val="0"/>
-          <w:i w:val="0"/>
-          <w:iCs w:val="0"/>
-          <w:color w:val="111111"/>
-          <w:sz w:val="21"/>
-          <w:szCs w:val="21"/>
-          <w:rtl w:val="0"/>
-        </w:rPr>
-        <w:t xml:space="preserve">• Implemented draggable application windows, interactive navigation, responsive layouts, theme switching, dynamic clock behavior, and loading interactions.</w:t>
-      </w:r>
-      <w:r>
-        <w:rPr>
-          <w:rtl w:val="0"/>
-        </w:rPr>
-      </w:r>
-    </w:p>
-    <w:p>
-      <w:pPr>
-        <w:spacing w:after="7" w:before="0" w:line="257" w:lineRule="auto"/>
-        <w:ind w:left="230" w:hanging="115"/>
-        <w:rPr>
-          <w:sz w:val="21"/>
-          <w:szCs w:val="21"/>
-        </w:rPr>
-      </w:pPr>
-      <w:r>
-        <w:rPr>
-          <w:rFonts w:ascii="Arial" w:cs="Arial" w:eastAsia="Arial" w:hAnsi="Arial"/>
-          <w:b w:val="0"/>
-          <w:bCs w:val="0"/>
-          <w:i w:val="0"/>
-          <w:iCs w:val="0"/>
-          <w:color w:val="111111"/>
-          <w:sz w:val="21"/>
-          <w:szCs w:val="21"/>
-          <w:rtl w:val="0"/>
-        </w:rPr>
-        <w:t xml:space="preserve">• Built persistent client-side note functionality using browser local storage to preserve user-created data across sessions.</w:t>
-      </w:r>
-      <w:r>
-        <w:rPr>
-          <w:rtl w:val="0"/>
-        </w:rPr>
-      </w:r>
-    </w:p>
-    <w:p>
-      <w:pPr>
-        <w:spacing w:after="7" w:before="0" w:line="257" w:lineRule="auto"/>
-        <w:ind w:left="230" w:hanging="115"/>
-        <w:rPr>
-          <w:sz w:val="21"/>
-          <w:szCs w:val="21"/>
-        </w:rPr>
-      </w:pPr>
-      <w:r>
-        <w:rPr>
-          <w:rFonts w:ascii="Arial" w:cs="Arial" w:eastAsia="Arial" w:hAnsi="Arial"/>
-          <w:b w:val="0"/>
-          <w:bCs w:val="0"/>
-          <w:i w:val="0"/>
-          <w:iCs w:val="0"/>
-          <w:color w:val="111111"/>
-          <w:sz w:val="21"/>
-          <w:szCs w:val="21"/>
-          <w:rtl w:val="0"/>
-        </w:rPr>
-        <w:t xml:space="preserve">• Managed source code and deployment through GitHub and GitHub Pages.</w:t>
+          <w:color w:val="111111"/>
+          <w:sz w:val="19"/>
+          <w:szCs w:val="19"/>
+          <w:rtl w:val="0"/>
+        </w:rPr>
+        <w:t xml:space="preserve">Georgia State University - B.S. Computer Science</w:t>
+      </w:r>
+      <w:r>
+        <w:rPr>
+          <w:b w:val="1"/>
+          <w:bCs w:val="1"/>
+          <w:color w:val="666666"/>
+          <w:sz w:val="19"/>
+          <w:szCs w:val="19"/>
+          <w:rtl w:val="0"/>
+        </w:rPr>
+        <w:tab/>
+        <w:t xml:space="preserve">Aug 2021 - May 2022; Aug 2025 - Present</w:t>
+      </w:r>
+      <w:r>
+        <w:rPr>
+          <w:rtl w:val="0"/>
+        </w:rPr>
+      </w:r>
+    </w:p>
+    <w:p>
+      <w:pPr>
+        <w:spacing w:after="8" w:line="242" w:lineRule="auto"/>
+        <w:rPr>
+          <w:sz w:val="19"/>
+          <w:szCs w:val="19"/>
+        </w:rPr>
+      </w:pPr>
+      <w:r>
+        <w:rPr>
+          <w:color w:val="666666"/>
+          <w:sz w:val="19"/>
+          <w:szCs w:val="19"/>
+          <w:rtl w:val="0"/>
+        </w:rPr>
+        <w:t xml:space="preserve">Relevant Coursework: Data Structures, Software Development, System Level Programming</w:t>
+      </w:r>
+      <w:r>
+        <w:rPr>
+          <w:rtl w:val="0"/>
+        </w:rPr>
+      </w:r>
+    </w:p>
+    <w:p>
+      <w:pPr>
+        <w:tabs>
+          <w:tab w:val="right" w:leader="none" w:pos="10728"/>
+        </w:tabs>
+        <w:spacing w:before="14" w:line="255" w:lineRule="auto"/>
+        <w:rPr>
+          <w:sz w:val="19"/>
+          <w:szCs w:val="19"/>
+        </w:rPr>
+      </w:pPr>
+      <w:r>
+        <w:rPr>
+          <w:b w:val="1"/>
+          <w:bCs w:val="1"/>
+          <w:color w:val="111111"/>
+          <w:sz w:val="19"/>
+          <w:szCs w:val="19"/>
+          <w:rtl w:val="0"/>
+        </w:rPr>
+        <w:t xml:space="preserve">Georgia Institute of Technology - Student</w:t>
+      </w:r>
+      <w:r>
+        <w:rPr>
+          <w:b w:val="1"/>
+          <w:bCs w:val="1"/>
+          <w:color w:val="666666"/>
+          <w:sz w:val="19"/>
+          <w:szCs w:val="19"/>
+          <w:rtl w:val="0"/>
+        </w:rPr>
+        <w:tab/>
+        <w:t xml:space="preserve">Aug 2022 - May 2024</w:t>
+      </w:r>
+      <w:r>
+        <w:rPr>
+          <w:rtl w:val="0"/>
+        </w:rPr>
+      </w:r>
+    </w:p>
+    <w:p>
+      <w:pPr>
+        <w:spacing w:after="8" w:line="242" w:lineRule="auto"/>
+        <w:rPr>
+          <w:color w:val="1f4e79"/>
+          <w:sz w:val="22"/>
+          <w:szCs w:val="22"/>
+        </w:rPr>
+      </w:pPr>
+      <w:r>
+        <w:rPr>
+          <w:color w:val="666666"/>
+          <w:sz w:val="19"/>
+          <w:szCs w:val="19"/>
+          <w:rtl w:val="0"/>
+        </w:rPr>
+        <w:t xml:space="preserve">Coursework: Introduction to Python, Introduction to the Built Environment</w:t>
       </w:r>
       <w:r>
         <w:rPr>
@@ -385,8 +389,8 @@
         </w:pBdr>
         <w:spacing w:after="32" w:before="64" w:line="240" w:lineRule="auto"/>
         <w:rPr>
-          <w:sz w:val="24"/>
-          <w:szCs w:val="24"/>
+          <w:sz w:val="22"/>
+          <w:szCs w:val="22"/>
         </w:rPr>
       </w:pPr>
       <w:r>
@@ -397,8 +401,183 @@
           <w:i w:val="0"/>
           <w:iCs w:val="0"/>
           <w:color w:val="1f4e79"/>
-          <w:sz w:val="24"/>
-          <w:szCs w:val="24"/>
+          <w:sz w:val="22"/>
+          <w:szCs w:val="22"/>
+          <w:rtl w:val="0"/>
+        </w:rPr>
+        <w:t xml:space="preserve">PROJECTS</w:t>
+      </w:r>
+      <w:r>
+        <w:rPr>
+          <w:rtl w:val="0"/>
+        </w:rPr>
+      </w:r>
+    </w:p>
+    <w:p>
+      <w:pPr>
+        <w:spacing w:after="0" w:before="14" w:line="255" w:lineRule="auto"/>
+        <w:rPr>
+          <w:sz w:val="19"/>
+          <w:szCs w:val="19"/>
+        </w:rPr>
+      </w:pPr>
+      <w:r>
+        <w:rPr>
+          <w:rFonts w:ascii="Arial" w:cs="Arial" w:eastAsia="Arial" w:hAnsi="Arial"/>
+          <w:b w:val="1"/>
+          <w:bCs w:val="1"/>
+          <w:i w:val="0"/>
+          <w:iCs w:val="0"/>
+          <w:color w:val="111111"/>
+          <w:sz w:val="19"/>
+          <w:szCs w:val="19"/>
+          <w:rtl w:val="0"/>
+        </w:rPr>
+        <w:t xml:space="preserve">Interactive Desktop Portfolio - HTML, CSS, JavaScript, GitHub Pages</w:t>
+      </w:r>
+      <w:r>
+        <w:rPr>
+          <w:rtl w:val="0"/>
+        </w:rPr>
+      </w:r>
+    </w:p>
+    <w:p>
+      <w:pPr>
+        <w:spacing w:after="7" w:before="0" w:line="257" w:lineRule="auto"/>
+        <w:ind w:left="230" w:hanging="115"/>
+        <w:rPr>
+          <w:sz w:val="19"/>
+          <w:szCs w:val="19"/>
+        </w:rPr>
+      </w:pPr>
+      <w:r>
+        <w:rPr>
+          <w:rFonts w:ascii="Arial" w:cs="Arial" w:eastAsia="Arial" w:hAnsi="Arial"/>
+          <w:b w:val="0"/>
+          <w:bCs w:val="0"/>
+          <w:i w:val="0"/>
+          <w:iCs w:val="0"/>
+          <w:color w:val="111111"/>
+          <w:sz w:val="19"/>
+          <w:szCs w:val="19"/>
+          <w:rtl w:val="0"/>
+        </w:rPr>
+        <w:t xml:space="preserve">• Developed and deployed an interactive single-page web application using vanilla HTML, CSS, and JavaScript without external frameworks.</w:t>
+      </w:r>
+      <w:r>
+        <w:rPr>
+          <w:rtl w:val="0"/>
+        </w:rPr>
+      </w:r>
+    </w:p>
+    <w:p>
+      <w:pPr>
+        <w:spacing w:after="7" w:before="0" w:line="257" w:lineRule="auto"/>
+        <w:ind w:left="230" w:hanging="115"/>
+        <w:rPr>
+          <w:sz w:val="19"/>
+          <w:szCs w:val="19"/>
+        </w:rPr>
+      </w:pPr>
+      <w:r>
+        <w:rPr>
+          <w:rFonts w:ascii="Arial" w:cs="Arial" w:eastAsia="Arial" w:hAnsi="Arial"/>
+          <w:b w:val="0"/>
+          <w:bCs w:val="0"/>
+          <w:i w:val="0"/>
+          <w:iCs w:val="0"/>
+          <w:color w:val="111111"/>
+          <w:sz w:val="19"/>
+          <w:szCs w:val="19"/>
+          <w:rtl w:val="0"/>
+        </w:rPr>
+        <w:t xml:space="preserve">• Implemented draggable application windows, interactive navigation, responsive layouts, theme switching, dynamic clock behavior, and loading interactions.</w:t>
+      </w:r>
+      <w:r>
+        <w:rPr>
+          <w:rtl w:val="0"/>
+        </w:rPr>
+      </w:r>
+    </w:p>
+    <w:p>
+      <w:pPr>
+        <w:spacing w:after="7" w:before="0" w:line="257" w:lineRule="auto"/>
+        <w:ind w:left="230" w:hanging="115"/>
+        <w:rPr>
+          <w:sz w:val="19"/>
+          <w:szCs w:val="19"/>
+        </w:rPr>
+      </w:pPr>
+      <w:r>
+        <w:rPr>
+          <w:rFonts w:ascii="Arial" w:cs="Arial" w:eastAsia="Arial" w:hAnsi="Arial"/>
+          <w:b w:val="0"/>
+          <w:bCs w:val="0"/>
+          <w:i w:val="0"/>
+          <w:iCs w:val="0"/>
+          <w:color w:val="111111"/>
+          <w:sz w:val="19"/>
+          <w:szCs w:val="19"/>
+          <w:rtl w:val="0"/>
+        </w:rPr>
+        <w:t xml:space="preserve">• Built persistent client-side note functionality using browser local storage to preserve user-created data across sessions.</w:t>
+      </w:r>
+      <w:r>
+        <w:rPr>
+          <w:rtl w:val="0"/>
+        </w:rPr>
+      </w:r>
+    </w:p>
+    <w:p>
+      <w:pPr>
+        <w:spacing w:after="7" w:before="0" w:line="257" w:lineRule="auto"/>
+        <w:ind w:left="230" w:hanging="115"/>
+        <w:rPr>
+          <w:sz w:val="19"/>
+          <w:szCs w:val="19"/>
+        </w:rPr>
+      </w:pPr>
+      <w:r>
+        <w:rPr>
+          <w:rFonts w:ascii="Arial" w:cs="Arial" w:eastAsia="Arial" w:hAnsi="Arial"/>
+          <w:b w:val="0"/>
+          <w:bCs w:val="0"/>
+          <w:i w:val="0"/>
+          <w:iCs w:val="0"/>
+          <w:color w:val="111111"/>
+          <w:sz w:val="19"/>
+          <w:szCs w:val="19"/>
+          <w:rtl w:val="0"/>
+        </w:rPr>
+        <w:t xml:space="preserve">• Managed source code and deployment through GitHub and GitHub Pages.</w:t>
+      </w:r>
+      <w:r>
+        <w:rPr>
+          <w:rtl w:val="0"/>
+        </w:rPr>
+      </w:r>
+    </w:p>
+    <w:p>
+      <w:pPr>
+        <w:pBdr>
+          <w:bottom w:color="1f4e79" w:space="1" w:sz="10" w:val="single"/>
+        </w:pBdr>
+        <w:spacing w:after="32" w:before="64" w:line="240" w:lineRule="auto"/>
+        <w:rPr>
+          <w:sz w:val="22"/>
+          <w:szCs w:val="22"/>
+        </w:rPr>
+      </w:pPr>
+      <w:r>
+        <w:rPr>
+          <w:rFonts w:ascii="Arial" w:cs="Arial" w:eastAsia="Arial" w:hAnsi="Arial"/>
+          <w:b w:val="0"/>
+          <w:bCs w:val="0"/>
+          <w:i w:val="0"/>
+          <w:iCs w:val="0"/>
+          <w:color w:val="1f4e79"/>
+          <w:sz w:val="22"/>
+          <w:szCs w:val="22"/>
           <w:rtl w:val="0"/>
         </w:rPr>
         <w:t xml:space="preserve">SOFTWARE &amp; TECHNICAL EXPERIENCE</w:t>
@@ -416,8 +595,8 @@
         </w:tabs>
         <w:spacing w:after="0" w:before="14" w:line="255" w:lineRule="auto"/>
         <w:rPr>
-          <w:sz w:val="21"/>
-          <w:szCs w:val="21"/>
+          <w:sz w:val="19"/>
+          <w:szCs w:val="19"/>
         </w:rPr>
       </w:pPr>
       <w:r>
@@ -428,8 +607,8 @@
           <w:i w:val="0"/>
           <w:iCs w:val="0"/>
           <w:color w:val="111111"/>
-          <w:sz w:val="21"/>
-          <w:szCs w:val="21"/>
+          <w:sz w:val="19"/>
+          <w:szCs w:val="19"/>
           <w:rtl w:val="0"/>
         </w:rPr>
         <w:t xml:space="preserve">Georgia Tech VGDev - Software Developer &amp; Artist</w:t>
@@ -442,8 +621,8 @@
           <w:i w:val="0"/>
           <w:iCs w:val="0"/>
           <w:color w:val="666666"/>
-          <w:sz w:val="21"/>
-          <w:szCs w:val="21"/>
+          <w:sz w:val="19"/>
+          <w:szCs w:val="19"/>
           <w:rtl w:val="0"/>
         </w:rPr>
         <w:tab/>
@@ -460,20 +639,20 @@
         <w:spacing w:after="7" w:before="0" w:line="257" w:lineRule="auto"/>
         <w:ind w:left="230" w:hanging="115"/>
         <w:rPr>
-          <w:sz w:val="21"/>
-          <w:szCs w:val="21"/>
-        </w:rPr>
-      </w:pPr>
-      <w:r>
-        <w:rPr>
-          <w:rFonts w:ascii="Arial" w:cs="Arial" w:eastAsia="Arial" w:hAnsi="Arial"/>
-          <w:b w:val="0"/>
-          <w:bCs w:val="0"/>
-          <w:i w:val="0"/>
-          <w:iCs w:val="0"/>
-          <w:color w:val="111111"/>
-          <w:sz w:val="21"/>
-          <w:szCs w:val="21"/>
+          <w:sz w:val="19"/>
+          <w:szCs w:val="19"/>
+        </w:rPr>
+      </w:pPr>
+      <w:r>
+        <w:rPr>
+          <w:rFonts w:ascii="Arial" w:cs="Arial" w:eastAsia="Arial" w:hAnsi="Arial"/>
+          <w:b w:val="0"/>
+          <w:bCs w:val="0"/>
+          <w:i w:val="0"/>
+          <w:iCs w:val="0"/>
+          <w:color w:val="111111"/>
+          <w:sz w:val="19"/>
+          <w:szCs w:val="19"/>
           <w:rtl w:val="0"/>
         </w:rPr>
         <w:t xml:space="preserve">• Contributed software development work through Georgia Tech's student game development club on Obelisk, Willow, and Dive, implementing game logic in GML.</w:t>
@@ -489,20 +668,20 @@
         <w:spacing w:after="7" w:before="0" w:line="257" w:lineRule="auto"/>
         <w:ind w:left="230" w:hanging="115"/>
         <w:rPr>
-          <w:sz w:val="21"/>
-          <w:szCs w:val="21"/>
-        </w:rPr>
-      </w:pPr>
-      <w:r>
-        <w:rPr>
-          <w:rFonts w:ascii="Arial" w:cs="Arial" w:eastAsia="Arial" w:hAnsi="Arial"/>
-          <w:b w:val="0"/>
-          <w:bCs w:val="0"/>
-          <w:i w:val="0"/>
-          <w:iCs w:val="0"/>
-          <w:color w:val="111111"/>
-          <w:sz w:val="21"/>
-          <w:szCs w:val="21"/>
+          <w:sz w:val="19"/>
+          <w:szCs w:val="19"/>
+        </w:rPr>
+      </w:pPr>
+      <w:r>
+        <w:rPr>
+          <w:rFonts w:ascii="Arial" w:cs="Arial" w:eastAsia="Arial" w:hAnsi="Arial"/>
+          <w:b w:val="0"/>
+          <w:bCs w:val="0"/>
+          <w:i w:val="0"/>
+          <w:iCs w:val="0"/>
+          <w:color w:val="111111"/>
+          <w:sz w:val="19"/>
+          <w:szCs w:val="19"/>
           <w:rtl w:val="0"/>
         </w:rPr>
         <w:t xml:space="preserve">• Worked across software and digital production workflows, including sprites, backgrounds, character designs, 3D meshes, and textures.</w:t>
@@ -520,8 +699,8 @@
         </w:tabs>
         <w:spacing w:after="0" w:before="14" w:line="255" w:lineRule="auto"/>
         <w:rPr>
-          <w:sz w:val="21"/>
-          <w:szCs w:val="21"/>
+          <w:sz w:val="19"/>
+          <w:szCs w:val="19"/>
         </w:rPr>
       </w:pPr>
       <w:r>
@@ -532,8 +711,8 @@
           <w:i w:val="0"/>
           <w:iCs w:val="0"/>
           <w:color w:val="111111"/>
-          <w:sz w:val="21"/>
-          <w:szCs w:val="21"/>
+          <w:sz w:val="19"/>
+          <w:szCs w:val="19"/>
           <w:rtl w:val="0"/>
         </w:rPr>
         <w:t xml:space="preserve">Georgia State University - Technical Support Assistant</w:t>
@@ -546,8 +725,8 @@
           <w:i w:val="0"/>
           <w:iCs w:val="0"/>
           <w:color w:val="666666"/>
-          <w:sz w:val="21"/>
-          <w:szCs w:val="21"/>
+          <w:sz w:val="19"/>
+          <w:szCs w:val="19"/>
           <w:rtl w:val="0"/>
         </w:rPr>
         <w:tab/>
@@ -564,20 +743,20 @@
         <w:spacing w:after="7" w:before="0" w:line="257" w:lineRule="auto"/>
         <w:ind w:left="230" w:hanging="115"/>
         <w:rPr>
-          <w:sz w:val="21"/>
-          <w:szCs w:val="21"/>
-        </w:rPr>
-      </w:pPr>
-      <w:r>
-        <w:rPr>
-          <w:rFonts w:ascii="Arial" w:cs="Arial" w:eastAsia="Arial" w:hAnsi="Arial"/>
-          <w:b w:val="0"/>
-          <w:bCs w:val="0"/>
-          <w:i w:val="0"/>
-          <w:iCs w:val="0"/>
-          <w:color w:val="111111"/>
-          <w:sz w:val="21"/>
-          <w:szCs w:val="21"/>
+          <w:sz w:val="19"/>
+          <w:szCs w:val="19"/>
+        </w:rPr>
+      </w:pPr>
+      <w:r>
+        <w:rPr>
+          <w:rFonts w:ascii="Arial" w:cs="Arial" w:eastAsia="Arial" w:hAnsi="Arial"/>
+          <w:b w:val="0"/>
+          <w:bCs w:val="0"/>
+          <w:i w:val="0"/>
+          <w:iCs w:val="0"/>
+          <w:color w:val="111111"/>
+          <w:sz w:val="19"/>
+          <w:szCs w:val="19"/>
           <w:rtl w:val="0"/>
         </w:rPr>
         <w:t xml:space="preserve">• Troubleshoot and resolve computer, network, wireless, printer, and projector issues for faculty, staff, and students.</w:t>
@@ -593,20 +772,20 @@
         <w:spacing w:after="7" w:before="0" w:line="257" w:lineRule="auto"/>
         <w:ind w:left="230" w:hanging="115"/>
         <w:rPr>
-          <w:sz w:val="21"/>
-          <w:szCs w:val="21"/>
-        </w:rPr>
-      </w:pPr>
-      <w:r>
-        <w:rPr>
-          <w:rFonts w:ascii="Arial" w:cs="Arial" w:eastAsia="Arial" w:hAnsi="Arial"/>
-          <w:b w:val="0"/>
-          <w:bCs w:val="0"/>
-          <w:i w:val="0"/>
-          <w:iCs w:val="0"/>
-          <w:color w:val="111111"/>
-          <w:sz w:val="21"/>
-          <w:szCs w:val="21"/>
+          <w:sz w:val="19"/>
+          <w:szCs w:val="19"/>
+        </w:rPr>
+      </w:pPr>
+      <w:r>
+        <w:rPr>
+          <w:rFonts w:ascii="Arial" w:cs="Arial" w:eastAsia="Arial" w:hAnsi="Arial"/>
+          <w:b w:val="0"/>
+          <w:bCs w:val="0"/>
+          <w:i w:val="0"/>
+          <w:iCs w:val="0"/>
+          <w:color w:val="111111"/>
+          <w:sz w:val="19"/>
+          <w:szCs w:val="19"/>
           <w:rtl w:val="0"/>
         </w:rPr>
         <w:t xml:space="preserve">• Diagnose technical problems, communicate resolution steps clearly, and route escalations when additional support is required.</w:t>
@@ -624,8 +803,8 @@
         </w:tabs>
         <w:spacing w:after="0" w:before="14" w:line="255" w:lineRule="auto"/>
         <w:rPr>
-          <w:sz w:val="21"/>
-          <w:szCs w:val="21"/>
+          <w:sz w:val="19"/>
+          <w:szCs w:val="19"/>
         </w:rPr>
       </w:pPr>
       <w:r>
@@ -636,8 +815,8 @@
           <w:i w:val="0"/>
           <w:iCs w:val="0"/>
           <w:color w:val="111111"/>
-          <w:sz w:val="21"/>
-          <w:szCs w:val="21"/>
+          <w:sz w:val="19"/>
+          <w:szCs w:val="19"/>
           <w:rtl w:val="0"/>
         </w:rPr>
         <w:t xml:space="preserve">Freelance - Artist and Designer</w:t>
@@ -650,8 +829,8 @@
           <w:i w:val="0"/>
           <w:iCs w:val="0"/>
           <w:color w:val="666666"/>
-          <w:sz w:val="21"/>
-          <w:szCs w:val="21"/>
+          <w:sz w:val="19"/>
+          <w:szCs w:val="19"/>
           <w:rtl w:val="0"/>
         </w:rPr>
         <w:tab/>
@@ -668,20 +847,20 @@
         <w:spacing w:after="7" w:before="0" w:line="257" w:lineRule="auto"/>
         <w:ind w:left="230" w:hanging="115"/>
         <w:rPr>
-          <w:sz w:val="21"/>
-          <w:szCs w:val="21"/>
-        </w:rPr>
-      </w:pPr>
-      <w:r>
-        <w:rPr>
-          <w:rFonts w:ascii="Arial" w:cs="Arial" w:eastAsia="Arial" w:hAnsi="Arial"/>
-          <w:b w:val="0"/>
-          <w:bCs w:val="0"/>
-          <w:i w:val="0"/>
-          <w:iCs w:val="0"/>
-          <w:color w:val="111111"/>
-          <w:sz w:val="21"/>
-          <w:szCs w:val="21"/>
+          <w:sz w:val="19"/>
+          <w:szCs w:val="19"/>
+        </w:rPr>
+      </w:pPr>
+      <w:r>
+        <w:rPr>
+          <w:rFonts w:ascii="Arial" w:cs="Arial" w:eastAsia="Arial" w:hAnsi="Arial"/>
+          <w:b w:val="0"/>
+          <w:bCs w:val="0"/>
+          <w:i w:val="0"/>
+          <w:iCs w:val="0"/>
+          <w:color w:val="111111"/>
+          <w:sz w:val="19"/>
+          <w:szCs w:val="19"/>
           <w:rtl w:val="0"/>
         </w:rPr>
         <w:t xml:space="preserve">• Manage multiple projects through planning, prototyping, revision, and final production while coordinating client requirements and feedback.</w:t>
@@ -699,8 +878,8 @@
         </w:tabs>
         <w:spacing w:after="0" w:before="14" w:line="255" w:lineRule="auto"/>
         <w:rPr>
-          <w:sz w:val="21"/>
-          <w:szCs w:val="21"/>
+          <w:sz w:val="19"/>
+          <w:szCs w:val="19"/>
         </w:rPr>
       </w:pPr>
       <w:r>
@@ -711,8 +890,8 @@
           <w:i w:val="0"/>
           <w:iCs w:val="0"/>
           <w:color w:val="111111"/>
-          <w:sz w:val="21"/>
-          <w:szCs w:val="21"/>
+          <w:sz w:val="19"/>
+          <w:szCs w:val="19"/>
           <w:rtl w:val="0"/>
         </w:rPr>
         <w:t xml:space="preserve">Huntington Learning Center - Tutor</w:t>
@@ -725,8 +904,8 @@
           <w:i w:val="0"/>
           <w:iCs w:val="0"/>
           <w:color w:val="666666"/>
-          <w:sz w:val="21"/>
-          <w:szCs w:val="21"/>
+          <w:sz w:val="19"/>
+          <w:szCs w:val="19"/>
           <w:rtl w:val="0"/>
         </w:rPr>
         <w:tab/>
@@ -743,20 +922,20 @@
         <w:spacing w:after="7" w:before="0" w:line="257" w:lineRule="auto"/>
         <w:ind w:left="230" w:hanging="115"/>
         <w:rPr>
-          <w:sz w:val="21"/>
-          <w:szCs w:val="21"/>
-        </w:rPr>
-      </w:pPr>
-      <w:r>
-        <w:rPr>
-          <w:rFonts w:ascii="Arial" w:cs="Arial" w:eastAsia="Arial" w:hAnsi="Arial"/>
-          <w:b w:val="0"/>
-          <w:bCs w:val="0"/>
-          <w:i w:val="0"/>
-          <w:iCs w:val="0"/>
-          <w:color w:val="111111"/>
-          <w:sz w:val="21"/>
-          <w:szCs w:val="21"/>
+          <w:sz w:val="19"/>
+          <w:szCs w:val="19"/>
+        </w:rPr>
+      </w:pPr>
+      <w:r>
+        <w:rPr>
+          <w:rFonts w:ascii="Arial" w:cs="Arial" w:eastAsia="Arial" w:hAnsi="Arial"/>
+          <w:b w:val="0"/>
+          <w:bCs w:val="0"/>
+          <w:i w:val="0"/>
+          <w:iCs w:val="0"/>
+          <w:color w:val="111111"/>
+          <w:sz w:val="19"/>
+          <w:szCs w:val="19"/>
           <w:rtl w:val="0"/>
         </w:rPr>
         <w:t xml:space="preserve">• Monitored student performance, prepared reports, and developed targeted improvement plans based on progress data.</w:t>
@@ -774,8 +953,8 @@
         </w:pBdr>
         <w:spacing w:after="32" w:before="64" w:line="240" w:lineRule="auto"/>
         <w:rPr>
-          <w:sz w:val="24"/>
-          <w:szCs w:val="24"/>
+          <w:sz w:val="22"/>
+          <w:szCs w:val="22"/>
         </w:rPr>
       </w:pPr>
       <w:r>
@@ -786,27 +965,24 @@
           <w:i w:val="0"/>
           <w:iCs w:val="0"/>
           <w:color w:val="1f4e79"/>
-          <w:sz w:val="24"/>
-          <w:szCs w:val="24"/>
-          <w:rtl w:val="0"/>
-        </w:rPr>
-        <w:t xml:space="preserve">EDUCATION</w:t>
-      </w:r>
-      <w:r>
-        <w:rPr>
-          <w:rtl w:val="0"/>
-        </w:rPr>
-      </w:r>
-    </w:p>
-    <w:p>
-      <w:pPr>
-        <w:tabs>
-          <w:tab w:val="right" w:leader="none" w:pos="10728"/>
-        </w:tabs>
-        <w:spacing w:after="0" w:before="14" w:line="255" w:lineRule="auto"/>
-        <w:rPr>
-          <w:sz w:val="21"/>
-          <w:szCs w:val="21"/>
+          <w:sz w:val="22"/>
+          <w:szCs w:val="22"/>
+          <w:rtl w:val="0"/>
+        </w:rPr>
+        <w:t xml:space="preserve">LEADERSHIP &amp; ACTIVITIES</w:t>
+      </w:r>
+      <w:r>
+        <w:rPr>
+          <w:rtl w:val="0"/>
+        </w:rPr>
+      </w:r>
+    </w:p>
+    <w:p>
+      <w:pPr>
+        <w:spacing w:after="7" w:line="253" w:lineRule="auto"/>
+        <w:rPr>
+          <w:sz w:val="19"/>
+          <w:szCs w:val="19"/>
         </w:rPr>
       </w:pPr>
       <w:r>
@@ -817,12 +993,40 @@
           <w:i w:val="0"/>
           <w:iCs w:val="0"/>
           <w:color w:val="111111"/>
-          <w:sz w:val="21"/>
-          <w:szCs w:val="21"/>
-          <w:rtl w:val="0"/>
-        </w:rPr>
-        <w:t xml:space="preserve">Georgia State University - B.S. Computer Science</w:t>
-      </w:r>
+          <w:sz w:val="19"/>
+          <w:szCs w:val="19"/>
+          <w:rtl w:val="0"/>
+        </w:rPr>
+        <w:t xml:space="preserve">Girls Who Code - Project Manager (2019)</w:t>
+      </w:r>
+      <w:r>
+        <w:rPr>
+          <w:rFonts w:ascii="Arial" w:cs="Arial" w:eastAsia="Arial" w:hAnsi="Arial"/>
+          <w:b w:val="0"/>
+          <w:bCs w:val="0"/>
+          <w:i w:val="0"/>
+          <w:iCs w:val="0"/>
+          <w:color w:val="111111"/>
+          <w:sz w:val="19"/>
+          <w:szCs w:val="19"/>
+          <w:rtl w:val="0"/>
+        </w:rPr>
+        <w:t xml:space="preserve"> | Organized meetings, outreach, surveys, events, and internal coordination.</w:t>
+      </w:r>
+      <w:r>
+        <w:rPr>
+          <w:rtl w:val="0"/>
+        </w:rPr>
+      </w:r>
+    </w:p>
+    <w:p>
+      <w:pPr>
+        <w:spacing w:after="7" w:line="253" w:lineRule="auto"/>
+        <w:rPr>
+          <w:sz w:val="19"/>
+          <w:szCs w:val="19"/>
+        </w:rPr>
+      </w:pPr>
       <w:r>
         <w:rPr>
           <w:rFonts w:ascii="Arial" w:cs="Arial" w:eastAsia="Arial" w:hAnsi="Arial"/>
@@ -830,57 +1034,39 @@
           <w:bCs w:val="1"/>
           <w:i w:val="0"/>
           <w:iCs w:val="0"/>
-          <w:color w:val="666666"/>
-          <w:sz w:val="21"/>
-          <w:szCs w:val="21"/>
-          <w:rtl w:val="0"/>
-        </w:rPr>
-        <w:tab/>
-        <w:t xml:space="preserve">Aug 2021 - May 2022; Aug 2025 - Present</w:t>
-      </w:r>
-      <w:r>
-        <w:rPr>
-          <w:rtl w:val="0"/>
-        </w:rPr>
-      </w:r>
-    </w:p>
-    <w:p>
-      <w:pPr>
-        <w:spacing w:after="8" w:before="0" w:line="242" w:lineRule="auto"/>
-        <w:rPr>
-          <w:sz w:val="21"/>
-          <w:szCs w:val="21"/>
-        </w:rPr>
-      </w:pPr>
-      <w:r>
-        <w:rPr>
-          <w:rFonts w:ascii="Arial" w:cs="Arial" w:eastAsia="Arial" w:hAnsi="Arial"/>
-          <w:b w:val="0"/>
-          <w:bCs w:val="0"/>
-          <w:i w:val="0"/>
-          <w:iCs w:val="0"/>
-          <w:color w:val="666666"/>
-          <w:sz w:val="21"/>
-          <w:szCs w:val="21"/>
-          <w:rtl w:val="0"/>
-        </w:rPr>
-        <w:t xml:space="preserve">Dean's List | Relevant Coursework: Data Structures, Discrete Mathematics</w:t>
-      </w:r>
-      <w:r>
-        <w:rPr>
-          <w:rtl w:val="0"/>
-        </w:rPr>
-      </w:r>
-    </w:p>
-    <w:p>
-      <w:pPr>
-        <w:tabs>
-          <w:tab w:val="right" w:leader="none" w:pos="10728"/>
-        </w:tabs>
-        <w:spacing w:after="0" w:before="14" w:line="255" w:lineRule="auto"/>
-        <w:rPr>
-          <w:sz w:val="21"/>
-          <w:szCs w:val="21"/>
+          <w:color w:val="111111"/>
+          <w:sz w:val="19"/>
+          <w:szCs w:val="19"/>
+          <w:rtl w:val="0"/>
+        </w:rPr>
+        <w:t xml:space="preserve">Asian Student Association - President (2019)</w:t>
+      </w:r>
+      <w:r>
+        <w:rPr>
+          <w:rFonts w:ascii="Arial" w:cs="Arial" w:eastAsia="Arial" w:hAnsi="Arial"/>
+          <w:b w:val="0"/>
+          <w:bCs w:val="0"/>
+          <w:i w:val="0"/>
+          <w:iCs w:val="0"/>
+          <w:color w:val="111111"/>
+          <w:sz w:val="19"/>
+          <w:szCs w:val="19"/>
+          <w:rtl w:val="0"/>
+        </w:rPr>
+        <w:t xml:space="preserve"> | Founding member; led meetings and coordinated officers and club initiatives.</w:t>
+      </w:r>
+      <w:r>
+        <w:rPr>
+          <w:rtl w:val="0"/>
+        </w:rPr>
+      </w:r>
+    </w:p>
+    <w:p>
+      <w:pPr>
+        <w:spacing w:after="7" w:line="253" w:lineRule="auto"/>
+        <w:rPr>
+          <w:sz w:val="19"/>
+          <w:szCs w:val="19"/>
         </w:rPr>
       </w:pPr>
       <w:r>
@@ -891,194 +1077,8 @@
           <w:i w:val="0"/>
           <w:iCs w:val="0"/>
           <w:color w:val="111111"/>
-          <w:sz w:val="21"/>
-          <w:szCs w:val="21"/>
-          <w:rtl w:val="0"/>
-        </w:rPr>
-        <w:t xml:space="preserve">Georgia Institute of Technology - Student</w:t>
-      </w:r>
-      <w:r>
-        <w:rPr>
-          <w:rFonts w:ascii="Arial" w:cs="Arial" w:eastAsia="Arial" w:hAnsi="Arial"/>
-          <w:b w:val="1"/>
-          <w:bCs w:val="1"/>
-          <w:i w:val="0"/>
-          <w:iCs w:val="0"/>
-          <w:color w:val="666666"/>
-          <w:sz w:val="21"/>
-          <w:szCs w:val="21"/>
-          <w:rtl w:val="0"/>
-        </w:rPr>
-        <w:tab/>
-        <w:t xml:space="preserve">Aug 2022 - May 2024</w:t>
-      </w:r>
-      <w:r>
-        <w:rPr>
-          <w:rtl w:val="0"/>
-        </w:rPr>
-      </w:r>
-    </w:p>
-    <w:p>
-      <w:pPr>
-        <w:spacing w:after="8" w:before="0" w:line="242" w:lineRule="auto"/>
-        <w:rPr>
-          <w:sz w:val="21"/>
-          <w:szCs w:val="21"/>
-        </w:rPr>
-      </w:pPr>
-      <w:r>
-        <w:rPr>
-          <w:rFonts w:ascii="Arial" w:cs="Arial" w:eastAsia="Arial" w:hAnsi="Arial"/>
-          <w:b w:val="0"/>
-          <w:bCs w:val="0"/>
-          <w:i w:val="0"/>
-          <w:iCs w:val="0"/>
-          <w:color w:val="666666"/>
-          <w:sz w:val="21"/>
-          <w:szCs w:val="21"/>
-          <w:rtl w:val="0"/>
-        </w:rPr>
-        <w:t xml:space="preserve">Coursework: Introduction to Python, Introduction to the Built Environment</w:t>
-      </w:r>
-      <w:r>
-        <w:rPr>
-          <w:rtl w:val="0"/>
-        </w:rPr>
-      </w:r>
-    </w:p>
-    <w:p>
-      <w:pPr>
-        <w:pBdr>
-          <w:bottom w:color="1f4e79" w:space="1" w:sz="10" w:val="single"/>
-        </w:pBdr>
-        <w:spacing w:after="32" w:before="64" w:line="240" w:lineRule="auto"/>
-        <w:rPr>
-          <w:sz w:val="24"/>
-          <w:szCs w:val="24"/>
-        </w:rPr>
-      </w:pPr>
-      <w:r>
-        <w:rPr>
-          <w:rFonts w:ascii="Arial" w:cs="Arial" w:eastAsia="Arial" w:hAnsi="Arial"/>
-          <w:b w:val="0"/>
-          <w:bCs w:val="0"/>
-          <w:i w:val="0"/>
-          <w:iCs w:val="0"/>
-          <w:color w:val="1f4e79"/>
-          <w:sz w:val="24"/>
-          <w:szCs w:val="24"/>
-          <w:rtl w:val="0"/>
-        </w:rPr>
-        <w:t xml:space="preserve">LEADERSHIP &amp; ACTIVITIES</w:t>
-      </w:r>
-      <w:r>
-        <w:rPr>
-          <w:rtl w:val="0"/>
-        </w:rPr>
-      </w:r>
-    </w:p>
-    <w:p>
-      <w:pPr>
-        <w:spacing w:after="7" w:line="253" w:lineRule="auto"/>
-        <w:rPr>
-          <w:sz w:val="21"/>
-          <w:szCs w:val="21"/>
-        </w:rPr>
-      </w:pPr>
-      <w:r>
-        <w:rPr>
-          <w:rFonts w:ascii="Arial" w:cs="Arial" w:eastAsia="Arial" w:hAnsi="Arial"/>
-          <w:b w:val="1"/>
-          <w:bCs w:val="1"/>
-          <w:i w:val="0"/>
-          <w:iCs w:val="0"/>
-          <w:color w:val="111111"/>
-          <w:sz w:val="21"/>
-          <w:szCs w:val="21"/>
-          <w:rtl w:val="0"/>
-        </w:rPr>
-        <w:t xml:space="preserve">Girls Who Code - Project Manager (2019)</w:t>
-      </w:r>
-      <w:r>
-        <w:rPr>
-          <w:rFonts w:ascii="Arial" w:cs="Arial" w:eastAsia="Arial" w:hAnsi="Arial"/>
-          <w:b w:val="0"/>
-          <w:bCs w:val="0"/>
-          <w:i w:val="0"/>
-          <w:iCs w:val="0"/>
-          <w:color w:val="111111"/>
-          <w:sz w:val="21"/>
-          <w:szCs w:val="21"/>
-          <w:rtl w:val="0"/>
-        </w:rPr>
-        <w:t xml:space="preserve"> | Organized meetings, outreach, surveys, events, and internal coordination.</w:t>
-      </w:r>
-      <w:r>
-        <w:rPr>
-          <w:rtl w:val="0"/>
-        </w:rPr>
-      </w:r>
-    </w:p>
-    <w:p>
-      <w:pPr>
-        <w:spacing w:after="7" w:line="253" w:lineRule="auto"/>
-        <w:rPr>
-          <w:sz w:val="21"/>
-          <w:szCs w:val="21"/>
-        </w:rPr>
-      </w:pPr>
-      <w:r>
-        <w:rPr>
-          <w:rFonts w:ascii="Arial" w:cs="Arial" w:eastAsia="Arial" w:hAnsi="Arial"/>
-          <w:b w:val="1"/>
-          <w:bCs w:val="1"/>
-          <w:i w:val="0"/>
-          <w:iCs w:val="0"/>
-          <w:color w:val="111111"/>
-          <w:sz w:val="21"/>
-          <w:szCs w:val="21"/>
-          <w:rtl w:val="0"/>
-        </w:rPr>
-        <w:t xml:space="preserve">Asian Student Association - President (2019)</w:t>
-      </w:r>
-      <w:r>
-        <w:rPr>
-          <w:rFonts w:ascii="Arial" w:cs="Arial" w:eastAsia="Arial" w:hAnsi="Arial"/>
-          <w:b w:val="0"/>
-          <w:bCs w:val="0"/>
-          <w:i w:val="0"/>
-          <w:iCs w:val="0"/>
-          <w:color w:val="111111"/>
-          <w:sz w:val="21"/>
-          <w:szCs w:val="21"/>
-          <w:rtl w:val="0"/>
-        </w:rPr>
-        <w:t xml:space="preserve"> | Founding member; led meetings and coordinated officers and club initiatives.</w:t>
-      </w:r>
-      <w:r>
-        <w:rPr>
-          <w:rtl w:val="0"/>
-        </w:rPr>
-      </w:r>
-    </w:p>
-    <w:p>
-      <w:pPr>
-        <w:spacing w:after="7" w:line="253" w:lineRule="auto"/>
-        <w:rPr>
-          <w:sz w:val="21"/>
-          <w:szCs w:val="21"/>
-        </w:rPr>
-      </w:pPr>
-      <w:r>
-        <w:rPr>
-          <w:rFonts w:ascii="Arial" w:cs="Arial" w:eastAsia="Arial" w:hAnsi="Arial"/>
-          <w:b w:val="1"/>
-          <w:bCs w:val="1"/>
-          <w:i w:val="0"/>
-          <w:iCs w:val="0"/>
-          <w:color w:val="111111"/>
-          <w:sz w:val="21"/>
-          <w:szCs w:val="21"/>
+          <w:sz w:val="19"/>
+          <w:szCs w:val="19"/>
           <w:rtl w:val="0"/>
         </w:rPr>
         <w:t xml:space="preserve">Governor's Honors Program - Visual Arts (2020)</w:t>
@@ -1091,8 +1091,8 @@
           <w:i w:val="0"/>
           <w:iCs w:val="0"/>
           <w:color w:val="111111"/>
-          <w:sz w:val="21"/>
-          <w:szCs w:val="21"/>
+          <w:sz w:val="19"/>
+          <w:szCs w:val="19"/>
           <w:rtl w:val="0"/>
         </w:rPr>
         <w:t xml:space="preserve"> | Selected for intensive artistic, professional, and leadership development.</w:t>
@@ -1105,7 +1105,7 @@
     </w:p>
     <w:sectPr>
       <w:pgSz w:h="15840" w:w="12240" w:orient="portrait"/>
-      <w:pgMar w:bottom="720" w:top="720" w:left="720" w:right="720" w:header="720" w:footer="720"/>
+      <w:pgMar w:bottom="1440" w:top="1440" w:left="1440" w:right="1440" w:header="720" w:footer="720"/>
       <w:pgNumType w:start="1"/>
     </w:sectPr>
   </w:body>

</xml_diff>